<commit_message>
docs: add an At a Glance architecture diagram page to the Word overview
A landscape fold-out on page 2 showing the whole path in one picture:
core.* study data, the frozen config_snapshot, the four API calls with
Gate 1, the Temporal handoff, the engine's numbered activities with the
batch loop and its continue_as_new, the three result tables, and Gate 2
with its three exits.

Rendered with PIL at 3x supersampling and placed at 10.00 x 7.33 in,
inside the 10 x 7.5 in usable area of a landscape US Letter section. The
ASCII flow in section 3 now points at it rather than standing alone.

Co-Authored-By: Claude Opus 5 (1M context) <noreply@anthropic.com>
</commit_message>
<xml_diff>
--- a/SSR_Engine_Architecture_Overview.docx
+++ b/SSR_Engine_Architecture_Overview.docx
@@ -82,9 +82,97 @@
       </w:r>
     </w:p>
     <w:p>
-      <w:r>
-        <w:br w:type="page"/>
-      </w:r>
+      <w:pPr>
+        <w:sectPr>
+          <w:pgSz w:w="12240" w:h="15840" w:orient="portrait"/>
+          <w:pgMar w:top="1080" w:right="1080" w:bottom="1080" w:left="1080" w:header="708" w:footer="708" w:gutter="0"/>
+          <w:pgNumType/>
+          <w:docGrid w:linePitch="360"/>
+        </w:sectPr>
+      </w:pPr>
+    </w:p>
+    <w:p>
+      <w:pPr>
+        <w:spacing w:after="60"/>
+      </w:pPr>
+      <w:r>
+        <w:rPr>
+          <w:b/>
+          <w:bCs/>
+          <w:color w:val="1F4E79"/>
+          <w:sz w:val="40"/>
+          <w:szCs w:val="40"/>
+        </w:rPr>
+        <w:t xml:space="preserve">At a Glance</w:t>
+      </w:r>
+    </w:p>
+    <w:p>
+      <w:pPr>
+        <w:spacing w:after="200"/>
+      </w:pPr>
+      <w:r>
+        <w:rPr>
+          <w:color w:val="5A5A5A"/>
+          <w:sz w:val="20"/>
+          <w:szCs w:val="20"/>
+        </w:rPr>
+        <w:t xml:space="preserve">The complete path of one study run: study data in core.*, frozen into a single config_snapshot, through two human approval gates, to a ranked result and a report.</w:t>
+      </w:r>
+    </w:p>
+    <w:p>
+      <w:pPr>
+        <w:jc w:val="center"/>
+      </w:pPr>
+      <w:r>
+        <w:drawing>
+          <wp:inline distT="0" distB="0" distL="0" distR="0">
+            <wp:extent cx="9144000" cy="6705600"/>
+            <wp:effectExtent t="0" r="0" b="0" l="0"/>
+            <wp:docPr id="1" name="" descr="" title=""/>
+            <wp:cNvGraphicFramePr>
+              <a:graphicFrameLocks xmlns:a="http://schemas.openxmlformats.org/drawingml/2006/main" noChangeAspect="1"/>
+            </wp:cNvGraphicFramePr>
+            <a:graphic xmlns:a="http://schemas.openxmlformats.org/drawingml/2006/main">
+              <a:graphicData uri="http://schemas.openxmlformats.org/drawingml/2006/picture">
+                <pic:pic xmlns:pic="http://schemas.openxmlformats.org/drawingml/2006/picture">
+                  <pic:nvPicPr>
+                    <pic:cNvPr id="0" name="" descr=""/>
+                    <pic:cNvPicPr>
+                      <a:picLocks noChangeAspect="1" noChangeArrowheads="1"/>
+                    </pic:cNvPicPr>
+                  </pic:nvPicPr>
+                  <pic:blipFill>
+                    <a:blip r:embed="rId7" cstate="none"/>
+                    <a:srcRect/>
+                    <a:stretch>
+                      <a:fillRect/>
+                    </a:stretch>
+                  </pic:blipFill>
+                  <pic:spPr bwMode="auto">
+                    <a:xfrm>
+                      <a:off x="0" y="0"/>
+                      <a:ext cx="9144000" cy="6705600"/>
+                    </a:xfrm>
+                    <a:prstGeom prst="rect">
+                      <a:avLst/>
+                    </a:prstGeom>
+                  </pic:spPr>
+                </pic:pic>
+              </a:graphicData>
+            </a:graphic>
+          </wp:inline>
+        </w:drawing>
+      </w:r>
+    </w:p>
+    <w:p>
+      <w:pPr>
+        <w:sectPr>
+          <w:pgSz w:w="15840" w:h="12240" w:orient="landscape"/>
+          <w:pgMar w:top="720" w:right="720" w:bottom="720" w:left="720" w:header="708" w:footer="708" w:gutter="0"/>
+          <w:pgNumType/>
+          <w:docGrid w:linePitch="360"/>
+        </w:sectPr>
+      </w:pPr>
     </w:p>
     <w:p>
       <w:pPr>
@@ -828,6 +916,21 @@
           <w:color w:val="1F4E79"/>
         </w:rPr>
         <w:t xml:space="preserve">3. End-to-end flow</w:t>
+      </w:r>
+    </w:p>
+    <w:p>
+      <w:pPr>
+        <w:spacing w:after="120" w:line="276"/>
+      </w:pPr>
+      <w:r>
+        <w:rPr>
+          <w:i/>
+          <w:iCs/>
+          <w:color w:val="5A5A5A"/>
+          <w:sz w:val="19"/>
+          <w:szCs w:val="19"/>
+        </w:rPr>
+        <w:t xml:space="preserve">The same flow as the At a Glance diagram on page 2, in text form:</w:t>
       </w:r>
     </w:p>
     <w:p>

</xml_diff>